<commit_message>
1. integrasi database dan fitur ekspor impor 2. rombak UI
</commit_message>
<xml_diff>
--- a/resources/templates/TEMPLATE KETERANGAN TIDAK MAMPU.docx
+++ b/resources/templates/TEMPLATE KETERANGAN TIDAK MAMPU.docx
@@ -185,6 +185,7 @@
           <w:szCs w:val="24"/>
         </w:rPr>
       </w:pPr>
+      <w:proofErr w:type="spellStart"/>
       <w:r>
         <w:rPr>
           <w:rFonts w:ascii="Arial" w:hAnsi="Arial" w:cs="Arial"/>
@@ -192,7 +193,35 @@
           <w:sz w:val="24"/>
           <w:szCs w:val="24"/>
         </w:rPr>
-        <w:t xml:space="preserve">No. 138/  </w:t>
+        <w:t>No</w:t>
+      </w:r>
+      <w:r>
+        <w:rPr>
+          <w:rFonts w:ascii="Arial" w:hAnsi="Arial" w:cs="Arial"/>
+          <w:b w:val="0"/>
+          <w:sz w:val="24"/>
+          <w:szCs w:val="24"/>
+        </w:rPr>
+        <w:t>mor</w:t>
+      </w:r>
+      <w:proofErr w:type="spellEnd"/>
+      <w:r>
+        <w:rPr>
+          <w:rFonts w:ascii="Arial" w:hAnsi="Arial" w:cs="Arial"/>
+          <w:b w:val="0"/>
+          <w:sz w:val="24"/>
+          <w:szCs w:val="24"/>
+        </w:rPr>
+        <w:t>:</w:t>
+      </w:r>
+      <w:r>
+        <w:rPr>
+          <w:rFonts w:ascii="Arial" w:hAnsi="Arial" w:cs="Arial"/>
+          <w:b w:val="0"/>
+          <w:sz w:val="24"/>
+          <w:szCs w:val="24"/>
+        </w:rPr>
+        <w:t xml:space="preserve"> 138/  </w:t>
       </w:r>
       <w:r>
         <w:rPr>
@@ -335,138 +364,209 @@
       </w:r>
       <w:proofErr w:type="gramEnd"/>
     </w:p>
-    <w:p>
-      <w:pPr>
-        <w:pStyle w:val="BodyText"/>
-        <w:spacing w:line="360" w:lineRule="auto"/>
-        <w:ind w:left="720"/>
-        <w:jc w:val="both"/>
-        <w:rPr>
-          <w:rFonts w:ascii="Arial" w:hAnsi="Arial" w:cs="Arial"/>
-          <w:b/>
-          <w:sz w:val="24"/>
-          <w:szCs w:val="24"/>
-        </w:rPr>
-      </w:pPr>
-      <w:r>
-        <w:rPr>
-          <w:rFonts w:ascii="Arial" w:hAnsi="Arial" w:cs="Arial"/>
-          <w:sz w:val="24"/>
-          <w:szCs w:val="24"/>
-        </w:rPr>
-        <w:t>Nama</w:t>
-      </w:r>
-      <w:r>
-        <w:rPr>
-          <w:rFonts w:ascii="Arial" w:hAnsi="Arial" w:cs="Arial"/>
-          <w:sz w:val="24"/>
-          <w:szCs w:val="24"/>
-        </w:rPr>
-        <w:tab/>
-      </w:r>
-      <w:r>
-        <w:rPr>
-          <w:rFonts w:ascii="Arial" w:hAnsi="Arial" w:cs="Arial"/>
-          <w:sz w:val="24"/>
-          <w:szCs w:val="24"/>
-        </w:rPr>
-        <w:tab/>
-      </w:r>
-      <w:r>
-        <w:rPr>
-          <w:rFonts w:ascii="Arial" w:hAnsi="Arial" w:cs="Arial"/>
-          <w:sz w:val="24"/>
-          <w:szCs w:val="24"/>
-        </w:rPr>
-        <w:tab/>
-        <w:t xml:space="preserve">: </w:t>
-      </w:r>
-      <w:r>
-        <w:rPr>
-          <w:rFonts w:ascii="Arial" w:hAnsi="Arial" w:cs="Arial"/>
-          <w:b/>
-          <w:sz w:val="24"/>
-          <w:szCs w:val="24"/>
-        </w:rPr>
-        <w:t>AGUS RUDI ISWANTO</w:t>
-      </w:r>
-    </w:p>
-    <w:p>
-      <w:pPr>
-        <w:pStyle w:val="BodyText"/>
-        <w:spacing w:line="360" w:lineRule="auto"/>
-        <w:ind w:left="720"/>
-        <w:jc w:val="both"/>
-        <w:rPr>
-          <w:rFonts w:ascii="Arial" w:hAnsi="Arial" w:cs="Arial"/>
-          <w:sz w:val="24"/>
-          <w:szCs w:val="24"/>
-        </w:rPr>
-      </w:pPr>
-      <w:proofErr w:type="spellStart"/>
-      <w:r>
-        <w:rPr>
-          <w:rFonts w:ascii="Arial" w:hAnsi="Arial" w:cs="Arial"/>
-          <w:sz w:val="24"/>
-          <w:szCs w:val="24"/>
-        </w:rPr>
-        <w:t>Jabatan</w:t>
-      </w:r>
-      <w:proofErr w:type="spellEnd"/>
-      <w:r>
-        <w:rPr>
-          <w:rFonts w:ascii="Arial" w:hAnsi="Arial" w:cs="Arial"/>
-          <w:sz w:val="24"/>
-          <w:szCs w:val="24"/>
-        </w:rPr>
-        <w:tab/>
-      </w:r>
-      <w:r>
-        <w:rPr>
-          <w:rFonts w:ascii="Arial" w:hAnsi="Arial" w:cs="Arial"/>
-          <w:sz w:val="24"/>
-          <w:szCs w:val="24"/>
-        </w:rPr>
-        <w:tab/>
-        <w:t>:</w:t>
-      </w:r>
-      <w:r>
-        <w:rPr>
-          <w:rFonts w:ascii="Arial" w:hAnsi="Arial" w:cs="Arial"/>
-          <w:sz w:val="24"/>
-          <w:szCs w:val="24"/>
-        </w:rPr>
-        <w:t xml:space="preserve"> </w:t>
-      </w:r>
-      <w:proofErr w:type="spellStart"/>
-      <w:r>
-        <w:rPr>
-          <w:rFonts w:ascii="Arial" w:hAnsi="Arial" w:cs="Arial"/>
-          <w:sz w:val="24"/>
-          <w:szCs w:val="24"/>
-        </w:rPr>
-        <w:t>Kepala</w:t>
-      </w:r>
-      <w:proofErr w:type="spellEnd"/>
-      <w:r>
-        <w:rPr>
-          <w:rFonts w:ascii="Arial" w:hAnsi="Arial" w:cs="Arial"/>
-          <w:sz w:val="24"/>
-          <w:szCs w:val="24"/>
-        </w:rPr>
-        <w:t xml:space="preserve"> Desa </w:t>
-      </w:r>
-      <w:proofErr w:type="spellStart"/>
-      <w:r>
-        <w:rPr>
-          <w:rFonts w:ascii="Arial" w:hAnsi="Arial" w:cs="Arial"/>
-          <w:sz w:val="24"/>
-          <w:szCs w:val="24"/>
-        </w:rPr>
-        <w:t>Sidodadi</w:t>
-      </w:r>
-      <w:proofErr w:type="spellEnd"/>
-    </w:p>
+    <w:tbl>
+      <w:tblPr>
+        <w:tblW w:w="8789" w:type="dxa"/>
+        <w:tblBorders>
+          <w:top w:val="nil"/>
+          <w:left w:val="nil"/>
+          <w:bottom w:val="nil"/>
+          <w:right w:val="nil"/>
+          <w:insideH w:val="nil"/>
+          <w:insideV w:val="nil"/>
+        </w:tblBorders>
+        <w:tblCellMar>
+          <w:left w:w="0" w:type="dxa"/>
+          <w:right w:w="0" w:type="dxa"/>
+        </w:tblCellMar>
+        <w:tblLook w:val="04A0" w:firstRow="1" w:lastRow="0" w:firstColumn="1" w:lastColumn="0" w:noHBand="0" w:noVBand="1"/>
+      </w:tblPr>
+      <w:tblGrid>
+        <w:gridCol w:w="2977"/>
+        <w:gridCol w:w="5812"/>
+      </w:tblGrid>
+      <w:tr>
+        <w:tc>
+          <w:tcPr>
+            <w:tcW w:w="2977" w:type="dxa"/>
+          </w:tcPr>
+          <w:p>
+            <w:pPr>
+              <w:pStyle w:val="BodyText"/>
+              <w:spacing w:line="360" w:lineRule="auto"/>
+              <w:ind w:left="720"/>
+              <w:jc w:val="both"/>
+              <w:rPr>
+                <w:rFonts w:ascii="Arial" w:hAnsi="Arial" w:cs="Arial"/>
+                <w:sz w:val="24"/>
+                <w:szCs w:val="24"/>
+              </w:rPr>
+            </w:pPr>
+            <w:r>
+              <w:rPr>
+                <w:rFonts w:ascii="Arial" w:hAnsi="Arial" w:cs="Arial"/>
+                <w:sz w:val="24"/>
+                <w:szCs w:val="24"/>
+              </w:rPr>
+              <w:t>Nama</w:t>
+            </w:r>
+            <w:r>
+              <w:rPr>
+                <w:rFonts w:ascii="Arial" w:hAnsi="Arial" w:cs="Arial"/>
+                <w:sz w:val="24"/>
+                <w:szCs w:val="24"/>
+              </w:rPr>
+              <w:tab/>
+            </w:r>
+            <w:r>
+              <w:rPr>
+                <w:rFonts w:ascii="Arial" w:hAnsi="Arial" w:cs="Arial"/>
+                <w:sz w:val="24"/>
+                <w:szCs w:val="24"/>
+              </w:rPr>
+              <w:tab/>
+            </w:r>
+            <w:r>
+              <w:rPr>
+                <w:rFonts w:ascii="Arial" w:hAnsi="Arial" w:cs="Arial"/>
+                <w:sz w:val="24"/>
+                <w:szCs w:val="24"/>
+              </w:rPr>
+              <w:tab/>
+              <w:t>:</w:t>
+            </w:r>
+          </w:p>
+        </w:tc>
+        <w:tc>
+          <w:tcPr>
+            <w:tcW w:w="5812" w:type="dxa"/>
+          </w:tcPr>
+          <w:p>
+            <w:pPr>
+              <w:pStyle w:val="BodyText"/>
+              <w:spacing w:line="360" w:lineRule="auto"/>
+              <w:ind w:left="7"/>
+              <w:jc w:val="both"/>
+              <w:rPr>
+                <w:rFonts w:ascii="Arial" w:hAnsi="Arial" w:cs="Arial"/>
+                <w:b/>
+                <w:bCs/>
+                <w:sz w:val="24"/>
+                <w:szCs w:val="24"/>
+              </w:rPr>
+            </w:pPr>
+            <w:r>
+              <w:rPr>
+                <w:rFonts w:ascii="Arial" w:hAnsi="Arial" w:cs="Arial"/>
+                <w:b/>
+                <w:bCs/>
+                <w:sz w:val="24"/>
+                <w:szCs w:val="24"/>
+              </w:rPr>
+              <w:t>AGUS RUDI ISWANTO</w:t>
+            </w:r>
+          </w:p>
+        </w:tc>
+      </w:tr>
+      <w:tr>
+        <w:tc>
+          <w:tcPr>
+            <w:tcW w:w="2977" w:type="dxa"/>
+          </w:tcPr>
+          <w:p>
+            <w:pPr>
+              <w:pStyle w:val="BodyText"/>
+              <w:spacing w:line="360" w:lineRule="auto"/>
+              <w:ind w:left="720"/>
+              <w:jc w:val="both"/>
+              <w:rPr>
+                <w:rFonts w:ascii="Arial" w:hAnsi="Arial" w:cs="Arial"/>
+                <w:sz w:val="24"/>
+                <w:szCs w:val="24"/>
+                <w:lang w:val="en-US"/>
+              </w:rPr>
+            </w:pPr>
+            <w:proofErr w:type="spellStart"/>
+            <w:r>
+              <w:rPr>
+                <w:rFonts w:ascii="Arial" w:hAnsi="Arial" w:cs="Arial"/>
+                <w:sz w:val="24"/>
+                <w:szCs w:val="24"/>
+              </w:rPr>
+              <w:t>Jabatan</w:t>
+            </w:r>
+            <w:proofErr w:type="spellEnd"/>
+            <w:r>
+              <w:rPr>
+                <w:rFonts w:ascii="Arial" w:hAnsi="Arial" w:cs="Arial"/>
+                <w:sz w:val="24"/>
+                <w:szCs w:val="24"/>
+              </w:rPr>
+              <w:tab/>
+            </w:r>
+            <w:r>
+              <w:rPr>
+                <w:rFonts w:ascii="Arial" w:hAnsi="Arial" w:cs="Arial"/>
+                <w:sz w:val="24"/>
+                <w:szCs w:val="24"/>
+              </w:rPr>
+              <w:tab/>
+              <w:t>:</w:t>
+            </w:r>
+          </w:p>
+        </w:tc>
+        <w:tc>
+          <w:tcPr>
+            <w:tcW w:w="5812" w:type="dxa"/>
+          </w:tcPr>
+          <w:p>
+            <w:pPr>
+              <w:pStyle w:val="BodyText"/>
+              <w:spacing w:line="360" w:lineRule="auto"/>
+              <w:ind w:left="7"/>
+              <w:jc w:val="both"/>
+              <w:rPr>
+                <w:rFonts w:ascii="Arial" w:hAnsi="Arial" w:cs="Arial"/>
+                <w:sz w:val="24"/>
+                <w:szCs w:val="24"/>
+                <w:lang w:val="en-US"/>
+              </w:rPr>
+            </w:pPr>
+            <w:proofErr w:type="spellStart"/>
+            <w:r>
+              <w:rPr>
+                <w:rFonts w:ascii="Arial" w:hAnsi="Arial" w:cs="Arial"/>
+                <w:sz w:val="24"/>
+                <w:szCs w:val="24"/>
+                <w:lang w:val="en-US"/>
+              </w:rPr>
+              <w:t>Kepala</w:t>
+            </w:r>
+            <w:proofErr w:type="spellEnd"/>
+            <w:r>
+              <w:rPr>
+                <w:rFonts w:ascii="Arial" w:hAnsi="Arial" w:cs="Arial"/>
+                <w:sz w:val="24"/>
+                <w:szCs w:val="24"/>
+                <w:lang w:val="en-US"/>
+              </w:rPr>
+              <w:t xml:space="preserve"> Desa </w:t>
+            </w:r>
+            <w:proofErr w:type="spellStart"/>
+            <w:r>
+              <w:rPr>
+                <w:rFonts w:ascii="Arial" w:hAnsi="Arial" w:cs="Arial"/>
+                <w:sz w:val="24"/>
+                <w:szCs w:val="24"/>
+                <w:lang w:val="en-US"/>
+              </w:rPr>
+              <w:t>Sidodadi</w:t>
+            </w:r>
+            <w:proofErr w:type="spellEnd"/>
+          </w:p>
+        </w:tc>
+      </w:tr>
+    </w:tbl>
     <w:p>
       <w:pPr>
         <w:pStyle w:val="BodyText"/>
@@ -3448,6 +3548,7 @@
   <w:style w:type="paragraph" w:default="1" w:styleId="Normal">
     <w:name w:val="Normal"/>
     <w:qFormat/>
+    <w:rsid w:val="005A629F"/>
     <w:rPr>
       <w:b/>
       <w:sz w:val="52"/>

</xml_diff>